<commit_message>
Restyle CZ/EN/RU CVs to match the original template design
Co-Authored-By: Claude Opus 5.5 <noreply@anthropic.com>
Claude-Session: https://claude.ai/code/session_01VE1bLi5VTBXn7QwuZiU1Kc
</commit_message>
<xml_diff>
--- a/cv/Melissa_Kangeldieva_SMM_CZ.docx
+++ b/cv/Melissa_Kangeldieva_SMM_CZ.docx
@@ -2,311 +2,390 @@
 <file path=word/document.xml><?xml version="1.0" encoding="utf-8"?>
 <w:document xmlns:wpc="http://schemas.microsoft.com/office/word/2010/wordprocessingCanvas" xmlns:mc="http://schemas.openxmlformats.org/markup-compatibility/2006" xmlns:o="urn:schemas-microsoft-com:office:office" xmlns:r="http://schemas.openxmlformats.org/officeDocument/2006/relationships" xmlns:m="http://schemas.openxmlformats.org/officeDocument/2006/math" xmlns:v="urn:schemas-microsoft-com:vml" xmlns:wp14="http://schemas.microsoft.com/office/word/2010/wordprocessingDrawing" xmlns:wp="http://schemas.openxmlformats.org/drawingml/2006/wordprocessingDrawing" xmlns:w10="urn:schemas-microsoft-com:office:word" xmlns:w="http://schemas.openxmlformats.org/wordprocessingml/2006/main" xmlns:w14="http://schemas.microsoft.com/office/word/2010/wordml" xmlns:w15="http://schemas.microsoft.com/office/word/2012/wordml" xmlns:wpg="http://schemas.microsoft.com/office/word/2010/wordprocessingGroup" xmlns:wpi="http://schemas.microsoft.com/office/word/2010/wordprocessingInk" xmlns:wne="http://schemas.microsoft.com/office/word/2006/wordml" xmlns:wps="http://schemas.microsoft.com/office/word/2010/wordprocessingShape" xmlns:cx="http://schemas.microsoft.com/office/drawing/2014/chartex" xmlns:cx1="http://schemas.microsoft.com/office/drawing/2015/9/8/chartex" xmlns:cx2="http://schemas.microsoft.com/office/drawing/2015/10/21/chartex" xmlns:cx3="http://schemas.microsoft.com/office/drawing/2016/5/9/chartex" xmlns:cx4="http://schemas.microsoft.com/office/drawing/2016/5/10/chartex" xmlns:cx5="http://schemas.microsoft.com/office/drawing/2016/5/11/chartex" xmlns:cx6="http://schemas.microsoft.com/office/drawing/2016/5/12/chartex" xmlns:cx7="http://schemas.microsoft.com/office/drawing/2016/5/13/chartex" xmlns:cx8="http://schemas.microsoft.com/office/drawing/2016/5/14/chartex" xmlns:aink="http://schemas.microsoft.com/office/drawing/2016/ink" xmlns:am3d="http://schemas.microsoft.com/office/drawing/2017/model3d" xmlns:w16cex="http://schemas.microsoft.com/office/word/2018/wordml/cex" xmlns:w16cid="http://schemas.microsoft.com/office/word/2016/wordml/cid" xmlns:w16="http://schemas.microsoft.com/office/word/2018/wordml" xmlns:w16sdtdh="http://schemas.microsoft.com/office/word/2020/wordml/sdtdatahash" xmlns:w16se="http://schemas.microsoft.com/office/word/2015/wordml/symex" mc:Ignorable="w14 w15 wp14">
   <w:body>
-    <w:p>
-      <w:pPr>
-        <w:spacing w:after="20"/>
-      </w:pPr>
-      <w:r>
-        <w:rPr>
-          <w:rFonts w:ascii="Arial" w:cs="Arial" w:eastAsia="Arial" w:hAnsi="Arial"/>
-          <w:b/>
-          <w:bCs/>
-          <w:color w:val="1E1B1A"/>
-          <w:spacing w:val="30"/>
-          <w:sz w:val="40"/>
-          <w:szCs w:val="40"/>
-        </w:rPr>
-        <w:t xml:space="preserve">MELISSA KANGELDIEVA</w:t>
-      </w:r>
-    </w:p>
-    <w:p>
-      <w:pPr>
-        <w:spacing w:after="60"/>
-      </w:pPr>
-      <w:r>
-        <w:rPr>
-          <w:rFonts w:ascii="Arial" w:cs="Arial" w:eastAsia="Arial" w:hAnsi="Arial"/>
-          <w:b/>
-          <w:bCs/>
-          <w:color w:val="5C3317"/>
-          <w:sz w:val="22"/>
-          <w:szCs w:val="22"/>
-        </w:rPr>
-        <w:t xml:space="preserve">SMM manažerka</w:t>
-      </w:r>
-      <w:r>
-        <w:rPr>
-          <w:rFonts w:ascii="Arial" w:cs="Arial" w:eastAsia="Arial" w:hAnsi="Arial"/>
-          <w:color w:val="5A5654"/>
-          <w:sz w:val="20"/>
-          <w:szCs w:val="20"/>
-        </w:rPr>
-        <w:t xml:space="preserve">  ·  Instagram / TikTok / Telegram / Facebook / Threads  ·  3+ roky praxe</w:t>
-      </w:r>
-    </w:p>
-    <w:p>
-      <w:pPr>
-        <w:spacing w:after="40"/>
-      </w:pPr>
-      <w:r>
-        <w:rPr>
-          <w:rFonts w:ascii="Arial" w:cs="Arial" w:eastAsia="Arial" w:hAnsi="Arial"/>
-          <w:color w:val="1E1B1A"/>
-          <w:sz w:val="20"/>
-          <w:szCs w:val="20"/>
-        </w:rPr>
-        <w:t xml:space="preserve">+420 777 987 587</w:t>
-      </w:r>
-      <w:r>
-        <w:rPr>
-          <w:rFonts w:ascii="Arial" w:cs="Arial" w:eastAsia="Arial" w:hAnsi="Arial"/>
-          <w:color w:val="5A5654"/>
-          <w:sz w:val="20"/>
-          <w:szCs w:val="20"/>
-        </w:rPr>
-        <w:t xml:space="preserve">   |   </w:t>
-      </w:r>
-      <w:hyperlink w:history="1" r:id="rIdbwnz1rafbacg108kebvyf">
+    <w:tbl>
+      <w:tblPr>
+        <w:tblW w:type="dxa" w:w="8506"/>
+        <w:tblBorders>
+          <w:top w:val="none" w:color="FFFFFF" w:sz="0"/>
+          <w:left w:val="none" w:color="FFFFFF" w:sz="0"/>
+          <w:bottom w:val="none" w:color="FFFFFF" w:sz="0"/>
+          <w:right w:val="none" w:color="FFFFFF" w:sz="0"/>
+          <w:insideH w:val="none" w:color="FFFFFF" w:sz="0"/>
+          <w:insideV w:val="none" w:color="FFFFFF" w:sz="0"/>
+        </w:tblBorders>
+      </w:tblPr>
+      <w:tblGrid>
+        <w:gridCol w:w="4253"/>
+        <w:gridCol w:w="4253"/>
+      </w:tblGrid>
+      <w:tr>
+        <w:tc>
+          <w:tcPr>
+            <w:tcW w:type="dxa" w:w="4253"/>
+            <w:tcBorders>
+              <w:top w:val="none" w:color="FFFFFF" w:sz="0"/>
+              <w:left w:val="none" w:color="FFFFFF" w:sz="0"/>
+              <w:bottom w:val="none" w:color="FFFFFF" w:sz="0"/>
+              <w:right w:val="none" w:color="FFFFFF" w:sz="0"/>
+            </w:tcBorders>
+            <w:vAlign w:val="center"/>
+          </w:tcPr>
+          <w:p>
+            <w:r>
+              <w:rPr>
+                <w:rFonts w:ascii="Times New Roman" w:cs="Times New Roman" w:eastAsia="Times New Roman" w:hAnsi="Times New Roman"/>
+                <w:color w:val="5C3317"/>
+                <w:sz w:val="32"/>
+                <w:szCs w:val="32"/>
+              </w:rPr>
+              <w:t xml:space="preserve">MELISSA</w:t>
+            </w:r>
+          </w:p>
+          <w:p>
+            <w:r>
+              <w:rPr>
+                <w:rFonts w:ascii="Times New Roman" w:cs="Times New Roman" w:eastAsia="Times New Roman" w:hAnsi="Times New Roman"/>
+                <w:color w:val="5C3317"/>
+                <w:sz w:val="32"/>
+                <w:szCs w:val="32"/>
+              </w:rPr>
+              <w:t xml:space="preserve">KANGELDIEVA</w:t>
+            </w:r>
+          </w:p>
+        </w:tc>
+        <w:tc>
+          <w:tcPr>
+            <w:tcW w:type="dxa" w:w="4253"/>
+            <w:tcBorders>
+              <w:top w:val="none" w:color="FFFFFF" w:sz="0"/>
+              <w:left w:val="none" w:color="FFFFFF" w:sz="0"/>
+              <w:bottom w:val="none" w:color="FFFFFF" w:sz="0"/>
+              <w:right w:val="none" w:color="FFFFFF" w:sz="0"/>
+            </w:tcBorders>
+            <w:vAlign w:val="center"/>
+          </w:tcPr>
+          <w:p>
+            <w:pPr>
+              <w:jc w:val="right"/>
+            </w:pPr>
+            <w:r>
+              <w:rPr>
+                <w:rFonts w:ascii="Arial" w:cs="Arial" w:eastAsia="Arial" w:hAnsi="Arial"/>
+                <w:b/>
+                <w:bCs/>
+                <w:color w:val="5C3317"/>
+                <w:sz w:val="17"/>
+                <w:szCs w:val="17"/>
+              </w:rPr>
+              <w:t xml:space="preserve">SMM manažerka</w:t>
+            </w:r>
+          </w:p>
+          <w:p>
+            <w:pPr>
+              <w:jc w:val="right"/>
+            </w:pPr>
+            <w:r>
+              <w:rPr>
+                <w:rFonts w:ascii="Arial" w:cs="Arial" w:eastAsia="Arial" w:hAnsi="Arial"/>
+                <w:b w:val="false"/>
+                <w:bCs w:val="false"/>
+                <w:color w:val="0E0F1A"/>
+                <w:sz w:val="17"/>
+                <w:szCs w:val="17"/>
+              </w:rPr>
+              <w:t xml:space="preserve">Instagram / TikTok / Telegram / Facebook / Threads</w:t>
+            </w:r>
+          </w:p>
+          <w:p>
+            <w:pPr>
+              <w:jc w:val="right"/>
+            </w:pPr>
+            <w:r>
+              <w:rPr>
+                <w:rFonts w:ascii="Arial" w:cs="Arial" w:eastAsia="Arial" w:hAnsi="Arial"/>
+                <w:b w:val="false"/>
+                <w:bCs w:val="false"/>
+                <w:color w:val="0E0F1A"/>
+                <w:sz w:val="17"/>
+                <w:szCs w:val="17"/>
+              </w:rPr>
+              <w:t xml:space="preserve">3+ roky praxe</w:t>
+            </w:r>
+          </w:p>
+          <w:p>
+            <w:pPr>
+              <w:jc w:val="right"/>
+            </w:pPr>
+            <w:r>
+              <w:rPr>
+                <w:rFonts w:ascii="Arial" w:cs="Arial" w:eastAsia="Arial" w:hAnsi="Arial"/>
+                <w:b w:val="false"/>
+                <w:bCs w:val="false"/>
+                <w:color w:val="0E0F1A"/>
+                <w:sz w:val="17"/>
+                <w:szCs w:val="17"/>
+              </w:rPr>
+              <w:t xml:space="preserve">+420 777 987 587</w:t>
+            </w:r>
+          </w:p>
+          <w:p>
+            <w:pPr>
+              <w:jc w:val="right"/>
+            </w:pPr>
+            <w:r>
+              <w:rPr>
+                <w:rFonts w:ascii="Arial" w:cs="Arial" w:eastAsia="Arial" w:hAnsi="Arial"/>
+                <w:b w:val="false"/>
+                <w:bCs w:val="false"/>
+                <w:color w:val="0E0F1A"/>
+                <w:sz w:val="17"/>
+                <w:szCs w:val="17"/>
+              </w:rPr>
+              <w:t xml:space="preserve">Česká republika</w:t>
+            </w:r>
+          </w:p>
+        </w:tc>
+      </w:tr>
+    </w:tbl>
+    <w:p>
+      <w:pPr>
+        <w:pBdr>
+          <w:bottom w:val="single" w:color="0E0F1A" w:sz="14" w:space="4"/>
+        </w:pBdr>
+        <w:spacing w:after="0"/>
+      </w:pPr>
+    </w:p>
+    <w:p>
+      <w:pPr>
+        <w:spacing w:after="0" w:before="100"/>
+        <w:jc w:val="center"/>
+      </w:pPr>
+      <w:hyperlink w:history="1" r:id="rIdwyq26afvootab_3z5lma9">
         <w:r>
           <w:rPr>
-            <w:rFonts w:ascii="Arial" w:cs="Arial" w:eastAsia="Arial" w:hAnsi="Arial"/>
-            <w:color w:val="1E1B1A"/>
-            <w:sz w:val="20"/>
-            <w:szCs w:val="20"/>
+            <w:rFonts w:ascii="Calibri" w:cs="Calibri" w:eastAsia="Calibri" w:hAnsi="Calibri"/>
+            <w:color w:val="5C3317"/>
+            <w:sz w:val="17"/>
+            <w:szCs w:val="17"/>
+            <w:u w:val="single"/>
           </w:rPr>
           <w:t xml:space="preserve">melisakangeldieva@icloud.com</w:t>
         </w:r>
       </w:hyperlink>
-      <w:r>
-        <w:rPr>
-          <w:rFonts w:ascii="Arial" w:cs="Arial" w:eastAsia="Arial" w:hAnsi="Arial"/>
-          <w:color w:val="5A5654"/>
-          <w:sz w:val="20"/>
-          <w:szCs w:val="20"/>
-        </w:rPr>
-        <w:t xml:space="preserve">   |   </w:t>
-      </w:r>
-      <w:r>
-        <w:rPr>
-          <w:rFonts w:ascii="Arial" w:cs="Arial" w:eastAsia="Arial" w:hAnsi="Arial"/>
-          <w:color w:val="1E1B1A"/>
-          <w:sz w:val="20"/>
-          <w:szCs w:val="20"/>
-        </w:rPr>
-        <w:t xml:space="preserve">Česká republika</w:t>
-      </w:r>
-    </w:p>
-    <w:p>
-      <w:pPr>
-        <w:pBdr>
-          <w:bottom w:val="single" w:color="5C3317" w:sz="6" w:space="2"/>
-        </w:pBdr>
-        <w:spacing w:after="80" w:before="200"/>
+    </w:p>
+    <w:p>
+      <w:pPr>
+        <w:keepNext/>
+        <w:spacing w:after="90" w:before="200"/>
+        <w:jc w:val="center"/>
+      </w:pPr>
+      <w:r>
+        <w:rPr>
+          <w:rFonts w:ascii="Calibri" w:cs="Calibri" w:eastAsia="Calibri" w:hAnsi="Calibri"/>
+          <w:color w:val="5C3317"/>
+          <w:sz w:val="26"/>
+          <w:szCs w:val="26"/>
+        </w:rPr>
+        <w:t xml:space="preserve">O MNĚ</w:t>
+      </w:r>
+    </w:p>
+    <w:p>
+      <w:pPr>
+        <w:spacing w:after="70" w:line="250"/>
+        <w:jc w:val="both"/>
+      </w:pPr>
+      <w:r>
+        <w:rPr>
+          <w:rFonts w:ascii="Arial" w:cs="Arial" w:eastAsia="Arial" w:hAnsi="Arial"/>
+          <w:color w:val="0E0F1A"/>
+          <w:sz w:val="17"/>
+          <w:szCs w:val="17"/>
+        </w:rPr>
+        <w:t xml:space="preserve">SMM specialistka s více než 3 lety zkušeností se správou sociálních sítí a tvorbou obsahu. Vytvářím SMM strategie a obsahové plány, natáčím a stříhám Reels a krátká videa, píšu poutavé texty a analyzuji výkon obsahu. Spolupracovala jsem se značkami CAPS Logistics, InWork a DemirBank a spravovala obsah pro různá odvětví a cílové skupiny. Spojuji kreativitu s důrazem na výsledky: zaměřuji se na růst publika, engagement, povědomí o značce a obsah, který podporuje obchodní cíle.</w:t>
+      </w:r>
+    </w:p>
+    <w:p>
+      <w:pPr>
+        <w:keepNext/>
+        <w:spacing w:after="90" w:before="200"/>
+        <w:jc w:val="center"/>
+      </w:pPr>
+      <w:r>
+        <w:rPr>
+          <w:rFonts w:ascii="Calibri" w:cs="Calibri" w:eastAsia="Calibri" w:hAnsi="Calibri"/>
+          <w:color w:val="5C3317"/>
+          <w:sz w:val="26"/>
+          <w:szCs w:val="26"/>
+        </w:rPr>
+        <w:t xml:space="preserve">DOVEDNOSTI</w:t>
+      </w:r>
+    </w:p>
+    <w:p>
+      <w:pPr>
+        <w:spacing w:after="70" w:line="250"/>
+        <w:jc w:val="both"/>
       </w:pPr>
       <w:r>
         <w:rPr>
           <w:rFonts w:ascii="Arial" w:cs="Arial" w:eastAsia="Arial" w:hAnsi="Arial"/>
           <w:b/>
           <w:bCs/>
-          <w:color w:val="5C3317"/>
-          <w:spacing w:val="20"/>
+          <w:color w:val="0E0F1A"/>
+          <w:sz w:val="17"/>
+          <w:szCs w:val="17"/>
+        </w:rPr>
+        <w:t xml:space="preserve">SMM a strategie: </w:t>
+      </w:r>
+      <w:r>
+        <w:rPr>
+          <w:rFonts w:ascii="Arial" w:cs="Arial" w:eastAsia="Arial" w:hAnsi="Arial"/>
+          <w:color w:val="0E0F1A"/>
+          <w:sz w:val="17"/>
+          <w:szCs w:val="17"/>
+        </w:rPr>
+        <w:t xml:space="preserve">SMM strategie, obsahové plánování, positioning značky, analýza trendů a konkurence, růst publika</w:t>
+      </w:r>
+    </w:p>
+    <w:p>
+      <w:pPr>
+        <w:spacing w:after="70" w:line="250"/>
+        <w:jc w:val="both"/>
+      </w:pPr>
+      <w:r>
+        <w:rPr>
+          <w:rFonts w:ascii="Arial" w:cs="Arial" w:eastAsia="Arial" w:hAnsi="Arial"/>
+          <w:b/>
+          <w:bCs/>
+          <w:color w:val="0E0F1A"/>
+          <w:sz w:val="17"/>
+          <w:szCs w:val="17"/>
+        </w:rPr>
+        <w:t xml:space="preserve">Obsah a produkce: </w:t>
+      </w:r>
+      <w:r>
+        <w:rPr>
+          <w:rFonts w:ascii="Arial" w:cs="Arial" w:eastAsia="Arial" w:hAnsi="Arial"/>
+          <w:color w:val="0E0F1A"/>
+          <w:sz w:val="17"/>
+          <w:szCs w:val="17"/>
+        </w:rPr>
+        <w:t xml:space="preserve">Reels, TikTok, Shorts, Stories, scénáře, copywriting, storytelling, produkce krátkých videí</w:t>
+      </w:r>
+    </w:p>
+    <w:p>
+      <w:pPr>
+        <w:spacing w:after="70" w:line="250"/>
+        <w:jc w:val="both"/>
+      </w:pPr>
+      <w:r>
+        <w:rPr>
+          <w:rFonts w:ascii="Arial" w:cs="Arial" w:eastAsia="Arial" w:hAnsi="Arial"/>
+          <w:b/>
+          <w:bCs/>
+          <w:color w:val="0E0F1A"/>
+          <w:sz w:val="17"/>
+          <w:szCs w:val="17"/>
+        </w:rPr>
+        <w:t xml:space="preserve">Kreativní nástroje: </w:t>
+      </w:r>
+      <w:r>
+        <w:rPr>
+          <w:rFonts w:ascii="Arial" w:cs="Arial" w:eastAsia="Arial" w:hAnsi="Arial"/>
+          <w:color w:val="0E0F1A"/>
+          <w:sz w:val="17"/>
+          <w:szCs w:val="17"/>
+        </w:rPr>
+        <w:t xml:space="preserve">CapCut, Adobe Premiere Pro, Canva, Figma, Lightroom</w:t>
+      </w:r>
+    </w:p>
+    <w:p>
+      <w:pPr>
+        <w:spacing w:after="70" w:line="250"/>
+        <w:jc w:val="both"/>
+      </w:pPr>
+      <w:r>
+        <w:rPr>
+          <w:rFonts w:ascii="Arial" w:cs="Arial" w:eastAsia="Arial" w:hAnsi="Arial"/>
+          <w:b/>
+          <w:bCs/>
+          <w:color w:val="0E0F1A"/>
+          <w:sz w:val="17"/>
+          <w:szCs w:val="17"/>
+        </w:rPr>
+        <w:t xml:space="preserve">Analytika a růst: </w:t>
+      </w:r>
+      <w:r>
+        <w:rPr>
+          <w:rFonts w:ascii="Arial" w:cs="Arial" w:eastAsia="Arial" w:hAnsi="Arial"/>
+          <w:color w:val="0E0F1A"/>
+          <w:sz w:val="17"/>
+          <w:szCs w:val="17"/>
+        </w:rPr>
+        <w:t xml:space="preserve">Meta Business Suite, Meta Ads Manager, Instagram a TikTok Analytics, YouTube Studio, sledování KPI, A/B testování, obsah zaměřený na konverze</w:t>
+      </w:r>
+    </w:p>
+    <w:p>
+      <w:pPr>
+        <w:keepNext/>
+        <w:spacing w:after="90" w:before="200"/>
+        <w:jc w:val="center"/>
+      </w:pPr>
+      <w:r>
+        <w:rPr>
+          <w:rFonts w:ascii="Calibri" w:cs="Calibri" w:eastAsia="Calibri" w:hAnsi="Calibri"/>
+          <w:color w:val="5C3317"/>
+          <w:sz w:val="26"/>
+          <w:szCs w:val="26"/>
+        </w:rPr>
+        <w:t xml:space="preserve">PRACOVNÍ ZKUŠENOSTI</w:t>
+      </w:r>
+    </w:p>
+    <w:p>
+      <w:pPr>
+        <w:keepNext/>
+        <w:spacing w:after="90" w:before="140"/>
+        <w:jc w:val="center"/>
+      </w:pPr>
+      <w:r>
+        <w:rPr>
+          <w:rFonts w:ascii="Calibri" w:cs="Calibri" w:eastAsia="Calibri" w:hAnsi="Calibri"/>
+          <w:b/>
+          <w:bCs/>
+          <w:color w:val="5C3317"/>
           <w:sz w:val="21"/>
           <w:szCs w:val="21"/>
-        </w:rPr>
-        <w:t xml:space="preserve">O MNĚ</w:t>
-      </w:r>
-    </w:p>
-    <w:p>
-      <w:pPr>
-        <w:spacing w:after="40" w:line="252"/>
-        <w:jc w:val="both"/>
-      </w:pPr>
-      <w:r>
-        <w:rPr>
-          <w:rFonts w:ascii="Arial" w:cs="Arial" w:eastAsia="Arial" w:hAnsi="Arial"/>
-          <w:color w:val="1E1B1A"/>
-          <w:sz w:val="20"/>
-          <w:szCs w:val="20"/>
-        </w:rPr>
-        <w:t xml:space="preserve">SMM specialistka s více než 3 lety zkušeností se správou sociálních sítí a tvorbou obsahu. Vytvářím SMM strategie a obsahové plány, natáčím a stříhám Reels a krátká videa, píšu poutavé texty a analyzuji výkon obsahu. Spolupracovala jsem se značkami CAPS Logistics, InWork a DemirBank a spravovala obsah pro různá odvětví a cílové skupiny. Spojuji kreativitu s důrazem na výsledky: zaměřuji se na růst publika, engagement, povědomí o značce a obsah, který podporuje obchodní cíle.</w:t>
-      </w:r>
-    </w:p>
-    <w:p>
-      <w:pPr>
-        <w:pBdr>
-          <w:bottom w:val="single" w:color="5C3317" w:sz="6" w:space="2"/>
-        </w:pBdr>
-        <w:spacing w:after="80" w:before="200"/>
-      </w:pPr>
-      <w:r>
-        <w:rPr>
-          <w:rFonts w:ascii="Arial" w:cs="Arial" w:eastAsia="Arial" w:hAnsi="Arial"/>
-          <w:b/>
-          <w:bCs/>
-          <w:color w:val="5C3317"/>
-          <w:spacing w:val="20"/>
+          <w:u w:val="single"/>
+        </w:rPr>
+        <w:t xml:space="preserve">DEMIRBANK</w:t>
+      </w:r>
+      <w:r>
+        <w:rPr>
+          <w:rFonts w:ascii="Calibri" w:cs="Calibri" w:eastAsia="Calibri" w:hAnsi="Calibri"/>
+          <w:color w:val="5C3317"/>
           <w:sz w:val="21"/>
           <w:szCs w:val="21"/>
         </w:rPr>
-        <w:t xml:space="preserve">DOVEDNOSTI</w:t>
-      </w:r>
-    </w:p>
-    <w:p>
-      <w:pPr>
-        <w:spacing w:after="40" w:line="252"/>
-      </w:pPr>
-      <w:r>
-        <w:rPr>
-          <w:rFonts w:ascii="Arial" w:cs="Arial" w:eastAsia="Arial" w:hAnsi="Arial"/>
-          <w:b/>
-          <w:bCs/>
-          <w:color w:val="1E1B1A"/>
-          <w:sz w:val="20"/>
-          <w:szCs w:val="20"/>
-        </w:rPr>
-        <w:t xml:space="preserve">SMM a strategie: </w:t>
-      </w:r>
-      <w:r>
-        <w:rPr>
-          <w:rFonts w:ascii="Arial" w:cs="Arial" w:eastAsia="Arial" w:hAnsi="Arial"/>
-          <w:color w:val="1E1B1A"/>
-          <w:sz w:val="20"/>
-          <w:szCs w:val="20"/>
-        </w:rPr>
-        <w:t xml:space="preserve">SMM strategie, obsahové plánování, positioning značky, analýza trendů a konkurence, růst publika</w:t>
-      </w:r>
-    </w:p>
-    <w:p>
-      <w:pPr>
-        <w:spacing w:after="40" w:line="252"/>
-      </w:pPr>
-      <w:r>
-        <w:rPr>
-          <w:rFonts w:ascii="Arial" w:cs="Arial" w:eastAsia="Arial" w:hAnsi="Arial"/>
-          <w:b/>
-          <w:bCs/>
-          <w:color w:val="1E1B1A"/>
-          <w:sz w:val="20"/>
-          <w:szCs w:val="20"/>
-        </w:rPr>
-        <w:t xml:space="preserve">Obsah a produkce: </w:t>
-      </w:r>
-      <w:r>
-        <w:rPr>
-          <w:rFonts w:ascii="Arial" w:cs="Arial" w:eastAsia="Arial" w:hAnsi="Arial"/>
-          <w:color w:val="1E1B1A"/>
-          <w:sz w:val="20"/>
-          <w:szCs w:val="20"/>
-        </w:rPr>
-        <w:t xml:space="preserve">Reels, TikTok, Shorts, Stories, scénáře, copywriting, storytelling, produkce krátkých videí</w:t>
-      </w:r>
-    </w:p>
-    <w:p>
-      <w:pPr>
-        <w:spacing w:after="40" w:line="252"/>
-      </w:pPr>
-      <w:r>
-        <w:rPr>
-          <w:rFonts w:ascii="Arial" w:cs="Arial" w:eastAsia="Arial" w:hAnsi="Arial"/>
-          <w:b/>
-          <w:bCs/>
-          <w:color w:val="1E1B1A"/>
-          <w:sz w:val="20"/>
-          <w:szCs w:val="20"/>
-        </w:rPr>
-        <w:t xml:space="preserve">Kreativní nástroje: </w:t>
-      </w:r>
-      <w:r>
-        <w:rPr>
-          <w:rFonts w:ascii="Arial" w:cs="Arial" w:eastAsia="Arial" w:hAnsi="Arial"/>
-          <w:color w:val="1E1B1A"/>
-          <w:sz w:val="20"/>
-          <w:szCs w:val="20"/>
-        </w:rPr>
-        <w:t xml:space="preserve">CapCut, Adobe Premiere Pro, Canva, Figma, Lightroom</w:t>
-      </w:r>
-    </w:p>
-    <w:p>
-      <w:pPr>
-        <w:spacing w:after="40" w:line="252"/>
-      </w:pPr>
-      <w:r>
-        <w:rPr>
-          <w:rFonts w:ascii="Arial" w:cs="Arial" w:eastAsia="Arial" w:hAnsi="Arial"/>
-          <w:b/>
-          <w:bCs/>
-          <w:color w:val="1E1B1A"/>
-          <w:sz w:val="20"/>
-          <w:szCs w:val="20"/>
-        </w:rPr>
-        <w:t xml:space="preserve">Analytika a růst: </w:t>
-      </w:r>
-      <w:r>
-        <w:rPr>
-          <w:rFonts w:ascii="Arial" w:cs="Arial" w:eastAsia="Arial" w:hAnsi="Arial"/>
-          <w:color w:val="1E1B1A"/>
-          <w:sz w:val="20"/>
-          <w:szCs w:val="20"/>
-        </w:rPr>
-        <w:t xml:space="preserve">Meta Business Suite, Meta Ads Manager, Instagram a TikTok Analytics, YouTube Studio, sledování KPI, A/B testování, obsah zaměřený na konverze</w:t>
-      </w:r>
-    </w:p>
-    <w:p>
-      <w:pPr>
-        <w:pBdr>
-          <w:bottom w:val="single" w:color="5C3317" w:sz="6" w:space="2"/>
-        </w:pBdr>
-        <w:spacing w:after="80" w:before="200"/>
-      </w:pPr>
-      <w:r>
-        <w:rPr>
-          <w:rFonts w:ascii="Arial" w:cs="Arial" w:eastAsia="Arial" w:hAnsi="Arial"/>
-          <w:b/>
-          <w:bCs/>
-          <w:color w:val="5C3317"/>
-          <w:spacing w:val="20"/>
-          <w:sz w:val="21"/>
-          <w:szCs w:val="21"/>
-        </w:rPr>
-        <w:t xml:space="preserve">PRACOVNÍ ZKUŠENOSTI</w:t>
-      </w:r>
-    </w:p>
-    <w:p>
-      <w:pPr>
-        <w:keepNext/>
-        <w:tabs>
-          <w:tab w:val="right" w:pos="10178"/>
-        </w:tabs>
-        <w:spacing w:after="40" w:before="120"/>
-      </w:pPr>
-      <w:r>
-        <w:rPr>
-          <w:rFonts w:ascii="Arial" w:cs="Arial" w:eastAsia="Arial" w:hAnsi="Arial"/>
-          <w:b/>
-          <w:bCs/>
-          <w:color w:val="1E1B1A"/>
-          <w:sz w:val="20"/>
-          <w:szCs w:val="20"/>
-        </w:rPr>
-        <w:t xml:space="preserve">DEMIRBANK</w:t>
-      </w:r>
-      <w:r>
-        <w:rPr>
-          <w:rFonts w:ascii="Arial" w:cs="Arial" w:eastAsia="Arial" w:hAnsi="Arial"/>
-          <w:color w:val="5A5654"/>
-          <w:sz w:val="18"/>
-          <w:szCs w:val="18"/>
-        </w:rPr>
-        <w:t xml:space="preserve">   @demirbankkg</w:t>
-      </w:r>
-      <w:r>
-        <w:rPr>
-          <w:rFonts w:ascii="Arial" w:cs="Arial" w:eastAsia="Arial" w:hAnsi="Arial"/>
-          <w:color w:val="5A5654"/>
-          <w:sz w:val="18"/>
-          <w:szCs w:val="18"/>
-        </w:rPr>
-        <w:t xml:space="preserve">	10/2024 – současnost (2+ roky)</w:t>
+        <w:t xml:space="preserve"> : 10/2024 – SOUČASNOST, </w:t>
+      </w:r>
+      <w:r>
+        <w:rPr>
+          <w:rFonts w:ascii="Calibri" w:cs="Calibri" w:eastAsia="Calibri" w:hAnsi="Calibri"/>
+          <w:color w:val="5C3317"/>
+          <w:sz w:val="15"/>
+          <w:szCs w:val="15"/>
+        </w:rPr>
+        <w:t xml:space="preserve">2+ ROKY, </w:t>
+      </w:r>
+      <w:r>
+        <w:rPr>
+          <w:rFonts w:ascii="Calibri" w:cs="Calibri" w:eastAsia="Calibri" w:hAnsi="Calibri"/>
+          <w:i/>
+          <w:iCs/>
+          <w:color w:val="5C3317"/>
+          <w:sz w:val="15"/>
+          <w:szCs w:val="15"/>
+        </w:rPr>
+        <w:t xml:space="preserve">@demirbankkg</w:t>
       </w:r>
     </w:p>
     <w:p>
@@ -316,14 +395,14 @@
           <w:ilvl w:val="0"/>
           <w:numId w:val="2"/>
         </w:numPr>
-        <w:spacing w:after="40" w:line="252"/>
-      </w:pPr>
-      <w:r>
-        <w:rPr>
-          <w:rFonts w:ascii="Arial" w:cs="Arial" w:eastAsia="Arial" w:hAnsi="Arial"/>
-          <w:color w:val="1E1B1A"/>
-          <w:sz w:val="20"/>
-          <w:szCs w:val="20"/>
+        <w:spacing w:after="10" w:line="245"/>
+      </w:pPr>
+      <w:r>
+        <w:rPr>
+          <w:rFonts w:ascii="Arial" w:cs="Arial" w:eastAsia="Arial" w:hAnsi="Arial"/>
+          <w:color w:val="0E0F1A"/>
+          <w:sz w:val="17"/>
+          <w:szCs w:val="17"/>
         </w:rPr>
         <w:t xml:space="preserve">Vyvíjím a realizuji obsahovou strategii sociálních sítí a řídím celý cyklus tvorby: od průzkumu trendů a kreativních konceptů přes scénáře, natáčení a střih až po publikaci a analýzu výsledků.</w:t>
       </w:r>
@@ -335,14 +414,14 @@
           <w:ilvl w:val="0"/>
           <w:numId w:val="2"/>
         </w:numPr>
-        <w:spacing w:after="40" w:line="252"/>
-      </w:pPr>
-      <w:r>
-        <w:rPr>
-          <w:rFonts w:ascii="Arial" w:cs="Arial" w:eastAsia="Arial" w:hAnsi="Arial"/>
-          <w:color w:val="1E1B1A"/>
-          <w:sz w:val="20"/>
-          <w:szCs w:val="20"/>
+        <w:spacing w:after="10" w:line="245"/>
+      </w:pPr>
+      <w:r>
+        <w:rPr>
+          <w:rFonts w:ascii="Arial" w:cs="Arial" w:eastAsia="Arial" w:hAnsi="Arial"/>
+          <w:color w:val="0E0F1A"/>
+          <w:sz w:val="17"/>
+          <w:szCs w:val="17"/>
         </w:rPr>
         <w:t xml:space="preserve">Krátká videa s dosahem až </w:t>
       </w:r>
@@ -351,18 +430,18 @@
           <w:rFonts w:ascii="Arial" w:cs="Arial" w:eastAsia="Arial" w:hAnsi="Arial"/>
           <w:b/>
           <w:bCs/>
-          <w:color w:val="1E1B1A"/>
-          <w:sz w:val="20"/>
-          <w:szCs w:val="20"/>
+          <w:color w:val="0E0F1A"/>
+          <w:sz w:val="17"/>
+          <w:szCs w:val="17"/>
         </w:rPr>
         <w:t xml:space="preserve">290 000 organických zhlédnutí</w:t>
       </w:r>
       <w:r>
         <w:rPr>
           <w:rFonts w:ascii="Arial" w:cs="Arial" w:eastAsia="Arial" w:hAnsi="Arial"/>
-          <w:color w:val="1E1B1A"/>
-          <w:sz w:val="20"/>
-          <w:szCs w:val="20"/>
+          <w:color w:val="0E0F1A"/>
+          <w:sz w:val="17"/>
+          <w:szCs w:val="17"/>
         </w:rPr>
         <w:t xml:space="preserve"> bez placené propagace.</w:t>
       </w:r>
@@ -374,14 +453,14 @@
           <w:ilvl w:val="0"/>
           <w:numId w:val="2"/>
         </w:numPr>
-        <w:spacing w:after="40" w:line="252"/>
-      </w:pPr>
-      <w:r>
-        <w:rPr>
-          <w:rFonts w:ascii="Arial" w:cs="Arial" w:eastAsia="Arial" w:hAnsi="Arial"/>
-          <w:color w:val="1E1B1A"/>
-          <w:sz w:val="20"/>
-          <w:szCs w:val="20"/>
+        <w:spacing w:after="10" w:line="245"/>
+      </w:pPr>
+      <w:r>
+        <w:rPr>
+          <w:rFonts w:ascii="Arial" w:cs="Arial" w:eastAsia="Arial" w:hAnsi="Arial"/>
+          <w:color w:val="0E0F1A"/>
+          <w:sz w:val="17"/>
+          <w:szCs w:val="17"/>
         </w:rPr>
         <w:t xml:space="preserve">Kampaňový obsah, který s cílenou reklamou dosáhl až </w:t>
       </w:r>
@@ -390,18 +469,18 @@
           <w:rFonts w:ascii="Arial" w:cs="Arial" w:eastAsia="Arial" w:hAnsi="Arial"/>
           <w:b/>
           <w:bCs/>
-          <w:color w:val="1E1B1A"/>
-          <w:sz w:val="20"/>
-          <w:szCs w:val="20"/>
+          <w:color w:val="0E0F1A"/>
+          <w:sz w:val="17"/>
+          <w:szCs w:val="17"/>
         </w:rPr>
         <w:t xml:space="preserve">4M zhlédnutí</w:t>
       </w:r>
       <w:r>
         <w:rPr>
           <w:rFonts w:ascii="Arial" w:cs="Arial" w:eastAsia="Arial" w:hAnsi="Arial"/>
-          <w:color w:val="1E1B1A"/>
-          <w:sz w:val="20"/>
-          <w:szCs w:val="20"/>
+          <w:color w:val="0E0F1A"/>
+          <w:sz w:val="17"/>
+          <w:szCs w:val="17"/>
         </w:rPr>
         <w:t xml:space="preserve">: kombinace organických kreativních konceptů a placené distribuce.</w:t>
       </w:r>
@@ -413,14 +492,14 @@
           <w:ilvl w:val="0"/>
           <w:numId w:val="2"/>
         </w:numPr>
-        <w:spacing w:after="40" w:line="252"/>
-      </w:pPr>
-      <w:r>
-        <w:rPr>
-          <w:rFonts w:ascii="Arial" w:cs="Arial" w:eastAsia="Arial" w:hAnsi="Arial"/>
-          <w:color w:val="1E1B1A"/>
-          <w:sz w:val="20"/>
-          <w:szCs w:val="20"/>
+        <w:spacing w:after="10" w:line="245"/>
+      </w:pPr>
+      <w:r>
+        <w:rPr>
+          <w:rFonts w:ascii="Arial" w:cs="Arial" w:eastAsia="Arial" w:hAnsi="Arial"/>
+          <w:color w:val="0E0F1A"/>
+          <w:sz w:val="17"/>
+          <w:szCs w:val="17"/>
         </w:rPr>
         <w:t xml:space="preserve">Tvořím Reels, Stories, propagační a vzdělávací obsah zaměřený na dosah, engagement, povědomí o značce a konverze.</w:t>
       </w:r>
@@ -432,14 +511,14 @@
           <w:ilvl w:val="0"/>
           <w:numId w:val="2"/>
         </w:numPr>
-        <w:spacing w:after="40" w:line="252"/>
-      </w:pPr>
-      <w:r>
-        <w:rPr>
-          <w:rFonts w:ascii="Arial" w:cs="Arial" w:eastAsia="Arial" w:hAnsi="Arial"/>
-          <w:color w:val="1E1B1A"/>
-          <w:sz w:val="20"/>
-          <w:szCs w:val="20"/>
+        <w:spacing w:after="10" w:line="245"/>
+      </w:pPr>
+      <w:r>
+        <w:rPr>
+          <w:rFonts w:ascii="Arial" w:cs="Arial" w:eastAsia="Arial" w:hAnsi="Arial"/>
+          <w:color w:val="0E0F1A"/>
+          <w:sz w:val="17"/>
+          <w:szCs w:val="17"/>
         </w:rPr>
         <w:t xml:space="preserve">Analyzuji výkon obsahu a průběžně testuji nové hooky, formáty, trendy a kreativní hypotézy.</w:t>
       </w:r>
@@ -447,39 +526,49 @@
     <w:p>
       <w:pPr>
         <w:keepNext/>
-        <w:tabs>
-          <w:tab w:val="right" w:pos="10178"/>
-        </w:tabs>
-        <w:spacing w:after="40" w:before="120"/>
-      </w:pPr>
-      <w:r>
-        <w:rPr>
-          <w:rFonts w:ascii="Arial" w:cs="Arial" w:eastAsia="Arial" w:hAnsi="Arial"/>
+        <w:spacing w:after="90" w:before="140"/>
+        <w:jc w:val="center"/>
+      </w:pPr>
+      <w:r>
+        <w:rPr>
+          <w:rFonts w:ascii="Calibri" w:cs="Calibri" w:eastAsia="Calibri" w:hAnsi="Calibri"/>
           <w:b/>
           <w:bCs/>
-          <w:color w:val="1E1B1A"/>
-          <w:sz w:val="20"/>
-          <w:szCs w:val="20"/>
+          <w:color w:val="5C3317"/>
+          <w:sz w:val="21"/>
+          <w:szCs w:val="21"/>
+          <w:u w:val="single"/>
         </w:rPr>
         <w:t xml:space="preserve">INWORK</w:t>
       </w:r>
       <w:r>
         <w:rPr>
-          <w:rFonts w:ascii="Arial" w:cs="Arial" w:eastAsia="Arial" w:hAnsi="Arial"/>
-          <w:color w:val="5A5654"/>
-          <w:sz w:val="18"/>
-          <w:szCs w:val="18"/>
-        </w:rPr>
-        <w:t xml:space="preserve">   @inwork.live</w:t>
-      </w:r>
-      <w:r>
-        <w:rPr>
-          <w:rFonts w:ascii="Arial" w:cs="Arial" w:eastAsia="Arial" w:hAnsi="Arial"/>
-          <w:color w:val="5A5654"/>
-          <w:sz w:val="18"/>
-          <w:szCs w:val="18"/>
-        </w:rPr>
-        <w:t xml:space="preserve">	09/2023 – 10/2024 (1 rok, 1 měsíc)</w:t>
+          <w:rFonts w:ascii="Calibri" w:cs="Calibri" w:eastAsia="Calibri" w:hAnsi="Calibri"/>
+          <w:color w:val="5C3317"/>
+          <w:sz w:val="21"/>
+          <w:szCs w:val="21"/>
+        </w:rPr>
+        <w:t xml:space="preserve"> : 09/2023 – 10/2024, </w:t>
+      </w:r>
+      <w:r>
+        <w:rPr>
+          <w:rFonts w:ascii="Calibri" w:cs="Calibri" w:eastAsia="Calibri" w:hAnsi="Calibri"/>
+          <w:color w:val="5C3317"/>
+          <w:sz w:val="15"/>
+          <w:szCs w:val="15"/>
+        </w:rPr>
+        <w:t xml:space="preserve">1 ROK, 1 MĚSÍC, </w:t>
+      </w:r>
+      <w:r>
+        <w:rPr>
+          <w:rFonts w:ascii="Calibri" w:cs="Calibri" w:eastAsia="Calibri" w:hAnsi="Calibri"/>
+          <w:i/>
+          <w:iCs/>
+          <w:color w:val="5C3317"/>
+          <w:sz w:val="15"/>
+          <w:szCs w:val="15"/>
+        </w:rPr>
+        <w:t xml:space="preserve">@inwork.live</w:t>
       </w:r>
     </w:p>
     <w:p>
@@ -489,14 +578,14 @@
           <w:ilvl w:val="0"/>
           <w:numId w:val="2"/>
         </w:numPr>
-        <w:spacing w:after="40" w:line="252"/>
-      </w:pPr>
-      <w:r>
-        <w:rPr>
-          <w:rFonts w:ascii="Arial" w:cs="Arial" w:eastAsia="Arial" w:hAnsi="Arial"/>
-          <w:color w:val="1E1B1A"/>
-          <w:sz w:val="20"/>
-          <w:szCs w:val="20"/>
+        <w:spacing w:after="10" w:line="245"/>
+      </w:pPr>
+      <w:r>
+        <w:rPr>
+          <w:rFonts w:ascii="Arial" w:cs="Arial" w:eastAsia="Arial" w:hAnsi="Arial"/>
+          <w:color w:val="0E0F1A"/>
+          <w:sz w:val="17"/>
+          <w:szCs w:val="17"/>
         </w:rPr>
         <w:t xml:space="preserve">Správa sociálních sítí a obsahu pro CRM platformu na evidenci pracovní doby: převod B2B digitálního produktu do poutavého a srozumitelného obsahu.</w:t>
       </w:r>
@@ -508,14 +597,14 @@
           <w:ilvl w:val="0"/>
           <w:numId w:val="2"/>
         </w:numPr>
-        <w:spacing w:after="40" w:line="252"/>
-      </w:pPr>
-      <w:r>
-        <w:rPr>
-          <w:rFonts w:ascii="Arial" w:cs="Arial" w:eastAsia="Arial" w:hAnsi="Arial"/>
-          <w:color w:val="1E1B1A"/>
-          <w:sz w:val="20"/>
-          <w:szCs w:val="20"/>
+        <w:spacing w:after="10" w:line="245"/>
+      </w:pPr>
+      <w:r>
+        <w:rPr>
+          <w:rFonts w:ascii="Arial" w:cs="Arial" w:eastAsia="Arial" w:hAnsi="Arial"/>
+          <w:color w:val="0E0F1A"/>
+          <w:sz w:val="17"/>
+          <w:szCs w:val="17"/>
         </w:rPr>
         <w:t xml:space="preserve">Vytvořila, natočila a sestříhala virální meme Reel s </w:t>
       </w:r>
@@ -524,18 +613,18 @@
           <w:rFonts w:ascii="Arial" w:cs="Arial" w:eastAsia="Arial" w:hAnsi="Arial"/>
           <w:b/>
           <w:bCs/>
-          <w:color w:val="1E1B1A"/>
-          <w:sz w:val="20"/>
-          <w:szCs w:val="20"/>
+          <w:color w:val="0E0F1A"/>
+          <w:sz w:val="17"/>
+          <w:szCs w:val="17"/>
         </w:rPr>
         <w:t xml:space="preserve">630 000+ organickými zhlédnutími</w:t>
       </w:r>
       <w:r>
         <w:rPr>
           <w:rFonts w:ascii="Arial" w:cs="Arial" w:eastAsia="Arial" w:hAnsi="Arial"/>
-          <w:color w:val="1E1B1A"/>
-          <w:sz w:val="20"/>
-          <w:szCs w:val="20"/>
+          <w:color w:val="0E0F1A"/>
+          <w:sz w:val="17"/>
+          <w:szCs w:val="17"/>
         </w:rPr>
         <w:t xml:space="preserve"> bez reklamy.</w:t>
       </w:r>
@@ -547,14 +636,14 @@
           <w:ilvl w:val="0"/>
           <w:numId w:val="2"/>
         </w:numPr>
-        <w:spacing w:after="40" w:line="252"/>
-      </w:pPr>
-      <w:r>
-        <w:rPr>
-          <w:rFonts w:ascii="Arial" w:cs="Arial" w:eastAsia="Arial" w:hAnsi="Arial"/>
-          <w:color w:val="1E1B1A"/>
-          <w:sz w:val="20"/>
-          <w:szCs w:val="20"/>
+        <w:spacing w:after="10" w:line="245"/>
+      </w:pPr>
+      <w:r>
+        <w:rPr>
+          <w:rFonts w:ascii="Arial" w:cs="Arial" w:eastAsia="Arial" w:hAnsi="Arial"/>
+          <w:color w:val="0E0F1A"/>
+          <w:sz w:val="17"/>
+          <w:szCs w:val="17"/>
         </w:rPr>
         <w:t xml:space="preserve">Obsahové plány, Reels, Stories, scénáře a kreativní koncepty; sledování trendů a jejich adaptace na značku.</w:t>
       </w:r>
@@ -566,14 +655,14 @@
           <w:ilvl w:val="0"/>
           <w:numId w:val="2"/>
         </w:numPr>
-        <w:spacing w:after="40" w:line="252"/>
-      </w:pPr>
-      <w:r>
-        <w:rPr>
-          <w:rFonts w:ascii="Arial" w:cs="Arial" w:eastAsia="Arial" w:hAnsi="Arial"/>
-          <w:color w:val="1E1B1A"/>
-          <w:sz w:val="20"/>
-          <w:szCs w:val="20"/>
+        <w:spacing w:after="10" w:line="245"/>
+      </w:pPr>
+      <w:r>
+        <w:rPr>
+          <w:rFonts w:ascii="Arial" w:cs="Arial" w:eastAsia="Arial" w:hAnsi="Arial"/>
+          <w:color w:val="0E0F1A"/>
+          <w:sz w:val="17"/>
+          <w:szCs w:val="17"/>
         </w:rPr>
         <w:t xml:space="preserve">Zaměření na růst organického dosahu, engagementu a povědomí o produktu prostřednictvím krátkých videí.</w:t>
       </w:r>
@@ -581,39 +670,49 @@
     <w:p>
       <w:pPr>
         <w:keepNext/>
-        <w:tabs>
-          <w:tab w:val="right" w:pos="10178"/>
-        </w:tabs>
-        <w:spacing w:after="40" w:before="120"/>
-      </w:pPr>
-      <w:r>
-        <w:rPr>
-          <w:rFonts w:ascii="Arial" w:cs="Arial" w:eastAsia="Arial" w:hAnsi="Arial"/>
+        <w:spacing w:after="90" w:before="140"/>
+        <w:jc w:val="center"/>
+      </w:pPr>
+      <w:r>
+        <w:rPr>
+          <w:rFonts w:ascii="Calibri" w:cs="Calibri" w:eastAsia="Calibri" w:hAnsi="Calibri"/>
           <w:b/>
           <w:bCs/>
-          <w:color w:val="1E1B1A"/>
-          <w:sz w:val="20"/>
-          <w:szCs w:val="20"/>
+          <w:color w:val="5C3317"/>
+          <w:sz w:val="21"/>
+          <w:szCs w:val="21"/>
+          <w:u w:val="single"/>
         </w:rPr>
         <w:t xml:space="preserve">CAPS LOGISTICS</w:t>
       </w:r>
       <w:r>
         <w:rPr>
-          <w:rFonts w:ascii="Arial" w:cs="Arial" w:eastAsia="Arial" w:hAnsi="Arial"/>
-          <w:color w:val="5A5654"/>
-          <w:sz w:val="18"/>
-          <w:szCs w:val="18"/>
-        </w:rPr>
-        <w:t xml:space="preserve">   @caps_logistics</w:t>
-      </w:r>
-      <w:r>
-        <w:rPr>
-          <w:rFonts w:ascii="Arial" w:cs="Arial" w:eastAsia="Arial" w:hAnsi="Arial"/>
-          <w:color w:val="5A5654"/>
-          <w:sz w:val="18"/>
-          <w:szCs w:val="18"/>
-        </w:rPr>
-        <w:t xml:space="preserve">	09/2023 – 10/2024 (1 rok, 1 měsíc)</w:t>
+          <w:rFonts w:ascii="Calibri" w:cs="Calibri" w:eastAsia="Calibri" w:hAnsi="Calibri"/>
+          <w:color w:val="5C3317"/>
+          <w:sz w:val="21"/>
+          <w:szCs w:val="21"/>
+        </w:rPr>
+        <w:t xml:space="preserve"> : 09/2023 – 10/2024, </w:t>
+      </w:r>
+      <w:r>
+        <w:rPr>
+          <w:rFonts w:ascii="Calibri" w:cs="Calibri" w:eastAsia="Calibri" w:hAnsi="Calibri"/>
+          <w:color w:val="5C3317"/>
+          <w:sz w:val="15"/>
+          <w:szCs w:val="15"/>
+        </w:rPr>
+        <w:t xml:space="preserve">1 ROK, 1 MĚSÍC, </w:t>
+      </w:r>
+      <w:r>
+        <w:rPr>
+          <w:rFonts w:ascii="Calibri" w:cs="Calibri" w:eastAsia="Calibri" w:hAnsi="Calibri"/>
+          <w:i/>
+          <w:iCs/>
+          <w:color w:val="5C3317"/>
+          <w:sz w:val="15"/>
+          <w:szCs w:val="15"/>
+        </w:rPr>
+        <w:t xml:space="preserve">@caps_logistics</w:t>
       </w:r>
     </w:p>
     <w:p>
@@ -623,14 +722,14 @@
           <w:ilvl w:val="0"/>
           <w:numId w:val="2"/>
         </w:numPr>
-        <w:spacing w:after="40" w:line="252"/>
-      </w:pPr>
-      <w:r>
-        <w:rPr>
-          <w:rFonts w:ascii="Arial" w:cs="Arial" w:eastAsia="Arial" w:hAnsi="Arial"/>
-          <w:color w:val="1E1B1A"/>
-          <w:sz w:val="20"/>
-          <w:szCs w:val="20"/>
+        <w:spacing w:after="10" w:line="245"/>
+      </w:pPr>
+      <w:r>
+        <w:rPr>
+          <w:rFonts w:ascii="Arial" w:cs="Arial" w:eastAsia="Arial" w:hAnsi="Arial"/>
+          <w:color w:val="0E0F1A"/>
+          <w:sz w:val="17"/>
+          <w:szCs w:val="17"/>
         </w:rPr>
         <w:t xml:space="preserve">Tvorba a správa obsahu sociálních sítí pro logistickou značku: obsahové plánování, kreativní koncepty, Reels, Stories a propagační příspěvky.</w:t>
       </w:r>
@@ -642,14 +741,14 @@
           <w:ilvl w:val="0"/>
           <w:numId w:val="2"/>
         </w:numPr>
-        <w:spacing w:after="40" w:line="252"/>
-      </w:pPr>
-      <w:r>
-        <w:rPr>
-          <w:rFonts w:ascii="Arial" w:cs="Arial" w:eastAsia="Arial" w:hAnsi="Arial"/>
-          <w:color w:val="1E1B1A"/>
-          <w:sz w:val="20"/>
-          <w:szCs w:val="20"/>
+        <w:spacing w:after="10" w:line="245"/>
+      </w:pPr>
+      <w:r>
+        <w:rPr>
+          <w:rFonts w:ascii="Arial" w:cs="Arial" w:eastAsia="Arial" w:hAnsi="Arial"/>
+          <w:color w:val="0E0F1A"/>
+          <w:sz w:val="17"/>
+          <w:szCs w:val="17"/>
         </w:rPr>
         <w:t xml:space="preserve">Převod oborových témat do přístupných a poutavých formátů pro sociální sítě.</w:t>
       </w:r>
@@ -661,14 +760,14 @@
           <w:ilvl w:val="0"/>
           <w:numId w:val="2"/>
         </w:numPr>
-        <w:spacing w:after="40" w:line="252"/>
-      </w:pPr>
-      <w:r>
-        <w:rPr>
-          <w:rFonts w:ascii="Arial" w:cs="Arial" w:eastAsia="Arial" w:hAnsi="Arial"/>
-          <w:color w:val="1E1B1A"/>
-          <w:sz w:val="20"/>
-          <w:szCs w:val="20"/>
+        <w:spacing w:after="10" w:line="245"/>
+      </w:pPr>
+      <w:r>
+        <w:rPr>
+          <w:rFonts w:ascii="Arial" w:cs="Arial" w:eastAsia="Arial" w:hAnsi="Arial"/>
+          <w:color w:val="0E0F1A"/>
+          <w:sz w:val="17"/>
+          <w:szCs w:val="17"/>
         </w:rPr>
         <w:t xml:space="preserve">Řízení produkčního cyklu obsahu od nápadu a scénáře po publikaci a analýzu výsledků.</w:t>
       </w:r>
@@ -676,39 +775,49 @@
     <w:p>
       <w:pPr>
         <w:keepNext/>
-        <w:tabs>
-          <w:tab w:val="right" w:pos="10178"/>
-        </w:tabs>
-        <w:spacing w:after="40" w:before="120"/>
-      </w:pPr>
-      <w:r>
-        <w:rPr>
-          <w:rFonts w:ascii="Arial" w:cs="Arial" w:eastAsia="Arial" w:hAnsi="Arial"/>
+        <w:spacing w:after="90" w:before="140"/>
+        <w:jc w:val="center"/>
+      </w:pPr>
+      <w:r>
+        <w:rPr>
+          <w:rFonts w:ascii="Calibri" w:cs="Calibri" w:eastAsia="Calibri" w:hAnsi="Calibri"/>
           <w:b/>
           <w:bCs/>
-          <w:color w:val="1E1B1A"/>
-          <w:sz w:val="20"/>
-          <w:szCs w:val="20"/>
+          <w:color w:val="5C3317"/>
+          <w:sz w:val="21"/>
+          <w:szCs w:val="21"/>
+          <w:u w:val="single"/>
         </w:rPr>
         <w:t xml:space="preserve">BAKYT IRSALIEV</w:t>
       </w:r>
       <w:r>
         <w:rPr>
-          <w:rFonts w:ascii="Arial" w:cs="Arial" w:eastAsia="Arial" w:hAnsi="Arial"/>
-          <w:color w:val="5A5654"/>
-          <w:sz w:val="18"/>
-          <w:szCs w:val="18"/>
-        </w:rPr>
-        <w:t xml:space="preserve">   @bakyt_irsaliev</w:t>
-      </w:r>
-      <w:r>
-        <w:rPr>
-          <w:rFonts w:ascii="Arial" w:cs="Arial" w:eastAsia="Arial" w:hAnsi="Arial"/>
-          <w:color w:val="5A5654"/>
-          <w:sz w:val="18"/>
-          <w:szCs w:val="18"/>
-        </w:rPr>
-        <w:t xml:space="preserve">	09/2023 – 10/2024 (1 rok, 1 měsíc)</w:t>
+          <w:rFonts w:ascii="Calibri" w:cs="Calibri" w:eastAsia="Calibri" w:hAnsi="Calibri"/>
+          <w:color w:val="5C3317"/>
+          <w:sz w:val="21"/>
+          <w:szCs w:val="21"/>
+        </w:rPr>
+        <w:t xml:space="preserve"> : 09/2023 – 10/2024, </w:t>
+      </w:r>
+      <w:r>
+        <w:rPr>
+          <w:rFonts w:ascii="Calibri" w:cs="Calibri" w:eastAsia="Calibri" w:hAnsi="Calibri"/>
+          <w:color w:val="5C3317"/>
+          <w:sz w:val="15"/>
+          <w:szCs w:val="15"/>
+        </w:rPr>
+        <w:t xml:space="preserve">1 ROK, 1 MĚSÍC, </w:t>
+      </w:r>
+      <w:r>
+        <w:rPr>
+          <w:rFonts w:ascii="Calibri" w:cs="Calibri" w:eastAsia="Calibri" w:hAnsi="Calibri"/>
+          <w:i/>
+          <w:iCs/>
+          <w:color w:val="5C3317"/>
+          <w:sz w:val="15"/>
+          <w:szCs w:val="15"/>
+        </w:rPr>
+        <w:t xml:space="preserve">@bakyt_irsaliev</w:t>
       </w:r>
     </w:p>
     <w:p>
@@ -718,14 +827,14 @@
           <w:ilvl w:val="0"/>
           <w:numId w:val="2"/>
         </w:numPr>
-        <w:spacing w:after="40" w:line="252"/>
-      </w:pPr>
-      <w:r>
-        <w:rPr>
-          <w:rFonts w:ascii="Arial" w:cs="Arial" w:eastAsia="Arial" w:hAnsi="Arial"/>
-          <w:color w:val="1E1B1A"/>
-          <w:sz w:val="20"/>
-          <w:szCs w:val="20"/>
+        <w:spacing w:after="10" w:line="245"/>
+      </w:pPr>
+      <w:r>
+        <w:rPr>
+          <w:rFonts w:ascii="Arial" w:cs="Arial" w:eastAsia="Arial" w:hAnsi="Arial"/>
+          <w:color w:val="0E0F1A"/>
+          <w:sz w:val="17"/>
+          <w:szCs w:val="17"/>
         </w:rPr>
         <w:t xml:space="preserve">Obsahová strategie a koncepty krátkých videí pro osobní značku.</w:t>
       </w:r>
@@ -737,14 +846,14 @@
           <w:ilvl w:val="0"/>
           <w:numId w:val="2"/>
         </w:numPr>
-        <w:spacing w:after="40" w:line="252"/>
-      </w:pPr>
-      <w:r>
-        <w:rPr>
-          <w:rFonts w:ascii="Arial" w:cs="Arial" w:eastAsia="Arial" w:hAnsi="Arial"/>
-          <w:color w:val="1E1B1A"/>
-          <w:sz w:val="20"/>
-          <w:szCs w:val="20"/>
+        <w:spacing w:after="10" w:line="245"/>
+      </w:pPr>
+      <w:r>
+        <w:rPr>
+          <w:rFonts w:ascii="Arial" w:cs="Arial" w:eastAsia="Arial" w:hAnsi="Arial"/>
+          <w:color w:val="0E0F1A"/>
+          <w:sz w:val="17"/>
+          <w:szCs w:val="17"/>
         </w:rPr>
         <w:t xml:space="preserve">Tvorba a produkce Reels s dosahem až </w:t>
       </w:r>
@@ -753,18 +862,18 @@
           <w:rFonts w:ascii="Arial" w:cs="Arial" w:eastAsia="Arial" w:hAnsi="Arial"/>
           <w:b/>
           <w:bCs/>
-          <w:color w:val="1E1B1A"/>
-          <w:sz w:val="20"/>
-          <w:szCs w:val="20"/>
+          <w:color w:val="0E0F1A"/>
+          <w:sz w:val="17"/>
+          <w:szCs w:val="17"/>
         </w:rPr>
         <w:t xml:space="preserve">30 000 organických zhlédnutí</w:t>
       </w:r>
       <w:r>
         <w:rPr>
           <w:rFonts w:ascii="Arial" w:cs="Arial" w:eastAsia="Arial" w:hAnsi="Arial"/>
-          <w:color w:val="1E1B1A"/>
-          <w:sz w:val="20"/>
-          <w:szCs w:val="20"/>
+          <w:color w:val="0E0F1A"/>
+          <w:sz w:val="17"/>
+          <w:szCs w:val="17"/>
         </w:rPr>
         <w:t xml:space="preserve"> bez placené propagace.</w:t>
       </w:r>
@@ -776,63 +885,61 @@
           <w:ilvl w:val="0"/>
           <w:numId w:val="2"/>
         </w:numPr>
-        <w:spacing w:after="40" w:line="252"/>
-      </w:pPr>
-      <w:r>
-        <w:rPr>
-          <w:rFonts w:ascii="Arial" w:cs="Arial" w:eastAsia="Arial" w:hAnsi="Arial"/>
-          <w:color w:val="1E1B1A"/>
-          <w:sz w:val="20"/>
-          <w:szCs w:val="20"/>
+        <w:spacing w:after="10" w:line="245"/>
+      </w:pPr>
+      <w:r>
+        <w:rPr>
+          <w:rFonts w:ascii="Arial" w:cs="Arial" w:eastAsia="Arial" w:hAnsi="Arial"/>
+          <w:color w:val="0E0F1A"/>
+          <w:sz w:val="17"/>
+          <w:szCs w:val="17"/>
         </w:rPr>
         <w:t xml:space="preserve">Osobní positioning, storytelling, scénáře, vizuální obsah a práce s publikem.</w:t>
       </w:r>
     </w:p>
     <w:p>
       <w:pPr>
-        <w:pBdr>
-          <w:bottom w:val="single" w:color="5C3317" w:sz="6" w:space="2"/>
-        </w:pBdr>
-        <w:spacing w:after="80" w:before="200"/>
-      </w:pPr>
-      <w:r>
-        <w:rPr>
-          <w:rFonts w:ascii="Arial" w:cs="Arial" w:eastAsia="Arial" w:hAnsi="Arial"/>
-          <w:b/>
-          <w:bCs/>
-          <w:color w:val="5C3317"/>
-          <w:spacing w:val="20"/>
-          <w:sz w:val="21"/>
-          <w:szCs w:val="21"/>
+        <w:keepNext/>
+        <w:spacing w:after="90" w:before="200"/>
+        <w:jc w:val="center"/>
+      </w:pPr>
+      <w:r>
+        <w:rPr>
+          <w:rFonts w:ascii="Calibri" w:cs="Calibri" w:eastAsia="Calibri" w:hAnsi="Calibri"/>
+          <w:color w:val="5C3317"/>
+          <w:sz w:val="26"/>
+          <w:szCs w:val="26"/>
         </w:rPr>
         <w:t xml:space="preserve">VZDĚLÁNÍ</w:t>
       </w:r>
     </w:p>
     <w:p>
-      <w:r>
-        <w:rPr>
-          <w:rFonts w:ascii="Arial" w:cs="Arial" w:eastAsia="Arial" w:hAnsi="Arial"/>
-          <w:b/>
-          <w:bCs/>
-          <w:color w:val="1E1B1A"/>
-          <w:sz w:val="20"/>
-          <w:szCs w:val="20"/>
+      <w:pPr>
+        <w:jc w:val="center"/>
+      </w:pPr>
+      <w:r>
+        <w:rPr>
+          <w:rFonts w:ascii="Calibri" w:cs="Calibri" w:eastAsia="Calibri" w:hAnsi="Calibri"/>
+          <w:color w:val="5C3317"/>
+          <w:sz w:val="18"/>
+          <w:szCs w:val="18"/>
+          <w:u w:val="single"/>
         </w:rPr>
         <w:t xml:space="preserve">Vysoká škola finanční a správní</w:t>
       </w:r>
       <w:r>
         <w:rPr>
-          <w:rFonts w:ascii="Arial" w:cs="Arial" w:eastAsia="Arial" w:hAnsi="Arial"/>
-          <w:color w:val="1E1B1A"/>
-          <w:sz w:val="20"/>
-          <w:szCs w:val="20"/>
+          <w:rFonts w:ascii="Calibri" w:cs="Calibri" w:eastAsia="Calibri" w:hAnsi="Calibri"/>
+          <w:color w:val="5C3317"/>
+          <w:sz w:val="18"/>
+          <w:szCs w:val="18"/>
         </w:rPr>
         <w:t xml:space="preserve"> — bakalářské studium, Marketingová komunikace</w:t>
       </w:r>
     </w:p>
     <w:sectPr>
       <w:pgSz w:w="11906" w:h="16838" w:orient="portrait"/>
-      <w:pgMar w:top="720" w:right="864" w:bottom="640" w:left="864" w:header="708" w:footer="708" w:gutter="0"/>
+      <w:pgMar w:top="700" w:right="1700" w:bottom="500" w:left="1700" w:header="708" w:footer="708" w:gutter="0"/>
       <w:pgNumType/>
       <w:docGrid w:linePitch="360"/>
     </w:sectPr>
@@ -1008,11 +1115,8 @@
       <w:lvlText w:val="•"/>
       <w:lvlJc w:val="left"/>
       <w:pPr>
-        <w:ind w:left="280" w:hanging="200"/>
-      </w:pPr>
-      <w:rPr>
-        <w:color w:val="5C3317"/>
-      </w:rPr>
+        <w:ind w:left="220" w:hanging="160"/>
+      </w:pPr>
     </w:lvl>
   </w:abstractNum>
   <w:num w:numId="1">
@@ -1036,9 +1140,9 @@
     <w:rPrDefault>
       <w:rPr>
         <w:rFonts w:ascii="Arial" w:cs="Arial" w:eastAsia="Arial" w:hAnsi="Arial"/>
-        <w:color w:val="1E1B1A"/>
-        <w:sz w:val="20"/>
-        <w:szCs w:val="20"/>
+        <w:color w:val="0E0F1A"/>
+        <w:sz w:val="17"/>
+        <w:szCs w:val="17"/>
       </w:rPr>
     </w:rPrDefault>
     <w:pPrDefault/>

</xml_diff>